<commit_message>
Today I have learn about various different patterns of generate functions urls path and I have learn about whats template and how it works and how to generate path for those and static css file setting .py file of any project"
</commit_message>
<xml_diff>
--- a/studyMaterail/Summary of Django.docx
+++ b/studyMaterail/Summary of Django.docx
@@ -5361,7 +5361,15 @@
     </w:p>
     <w:p/>
     <w:p>
-      <w:r>
+      <w:pPr>
+        <w:rPr>
+          <w:noProof/>
+        </w:rPr>
+      </w:pPr>
+      <w:r>
+        <w:rPr>
+          <w:noProof/>
+        </w:rPr>
         <w:drawing>
           <wp:inline distT="0" distB="0" distL="0" distR="0" wp14:anchorId="7EDA4377" wp14:editId="01B7616A">
             <wp:extent cx="5943600" cy="5179060"/>
@@ -5397,6 +5405,267 @@
             </a:graphic>
           </wp:inline>
         </w:drawing>
+      </w:r>
+    </w:p>
+    <w:p>
+      <w:pPr>
+        <w:tabs>
+          <w:tab w:val="left" w:pos="6312"/>
+        </w:tabs>
+      </w:pPr>
+      <w:r>
+        <w:tab/>
+      </w:r>
+    </w:p>
+    <w:p>
+      <w:pPr>
+        <w:tabs>
+          <w:tab w:val="left" w:pos="6312"/>
+        </w:tabs>
+      </w:pPr>
+    </w:p>
+    <w:p>
+      <w:pPr>
+        <w:tabs>
+          <w:tab w:val="left" w:pos="6312"/>
+        </w:tabs>
+      </w:pPr>
+    </w:p>
+    <w:p>
+      <w:pPr>
+        <w:tabs>
+          <w:tab w:val="left" w:pos="6312"/>
+        </w:tabs>
+      </w:pPr>
+    </w:p>
+    <w:p>
+      <w:pPr>
+        <w:tabs>
+          <w:tab w:val="left" w:pos="6312"/>
+        </w:tabs>
+      </w:pPr>
+    </w:p>
+    <w:p>
+      <w:pPr>
+        <w:tabs>
+          <w:tab w:val="left" w:pos="6312"/>
+        </w:tabs>
+      </w:pPr>
+    </w:p>
+    <w:p>
+      <w:pPr>
+        <w:pStyle w:val="IntenseQuote"/>
+      </w:pPr>
+      <w:r>
+        <w:lastRenderedPageBreak/>
+        <w:t>Understand the Render Function</w:t>
+      </w:r>
+    </w:p>
+    <w:p>
+      <w:pPr>
+        <w:tabs>
+          <w:tab w:val="left" w:pos="6312"/>
+        </w:tabs>
+        <w:rPr>
+          <w:noProof/>
+        </w:rPr>
+      </w:pPr>
+      <w:r>
+        <w:rPr>
+          <w:noProof/>
+        </w:rPr>
+        <w:drawing>
+          <wp:inline distT="0" distB="0" distL="0" distR="0" wp14:anchorId="2F0C3878" wp14:editId="0340D0FB">
+            <wp:extent cx="5943600" cy="5337810"/>
+            <wp:effectExtent l="0" t="0" r="0" b="0"/>
+            <wp:docPr id="1472119168" name="Picture 1"/>
+            <wp:cNvGraphicFramePr>
+              <a:graphicFrameLocks xmlns:a="http://schemas.openxmlformats.org/drawingml/2006/main" noChangeAspect="1"/>
+            </wp:cNvGraphicFramePr>
+            <a:graphic xmlns:a="http://schemas.openxmlformats.org/drawingml/2006/main">
+              <a:graphicData uri="http://schemas.openxmlformats.org/drawingml/2006/picture">
+                <pic:pic xmlns:pic="http://schemas.openxmlformats.org/drawingml/2006/picture">
+                  <pic:nvPicPr>
+                    <pic:cNvPr id="1472119168" name=""/>
+                    <pic:cNvPicPr/>
+                  </pic:nvPicPr>
+                  <pic:blipFill>
+                    <a:blip r:embed="rId23"/>
+                    <a:stretch>
+                      <a:fillRect/>
+                    </a:stretch>
+                  </pic:blipFill>
+                  <pic:spPr>
+                    <a:xfrm>
+                      <a:off x="0" y="0"/>
+                      <a:ext cx="5943600" cy="5337810"/>
+                    </a:xfrm>
+                    <a:prstGeom prst="rect">
+                      <a:avLst/>
+                    </a:prstGeom>
+                  </pic:spPr>
+                </pic:pic>
+              </a:graphicData>
+            </a:graphic>
+          </wp:inline>
+        </w:drawing>
+      </w:r>
+    </w:p>
+    <w:p/>
+    <w:p/>
+    <w:p/>
+    <w:p>
+      <w:pPr>
+        <w:rPr>
+          <w:noProof/>
+        </w:rPr>
+      </w:pPr>
+    </w:p>
+    <w:p>
+      <w:pPr>
+        <w:tabs>
+          <w:tab w:val="left" w:pos="5712"/>
+        </w:tabs>
+      </w:pPr>
+      <w:r>
+        <w:tab/>
+      </w:r>
+    </w:p>
+    <w:p>
+      <w:pPr>
+        <w:tabs>
+          <w:tab w:val="left" w:pos="5712"/>
+        </w:tabs>
+      </w:pPr>
+    </w:p>
+    <w:p>
+      <w:pPr>
+        <w:pStyle w:val="IntenseQuote"/>
+      </w:pPr>
+      <w:r>
+        <w:lastRenderedPageBreak/>
+        <w:t>Dynamic Template Files</w:t>
+      </w:r>
+    </w:p>
+    <w:p>
+      <w:pPr>
+        <w:tabs>
+          <w:tab w:val="left" w:pos="5712"/>
+        </w:tabs>
+      </w:pPr>
+    </w:p>
+    <w:p>
+      <w:pPr>
+        <w:tabs>
+          <w:tab w:val="left" w:pos="5712"/>
+        </w:tabs>
+      </w:pPr>
+    </w:p>
+    <w:p>
+      <w:pPr>
+        <w:tabs>
+          <w:tab w:val="left" w:pos="5712"/>
+        </w:tabs>
+      </w:pPr>
+      <w:r>
+        <w:rPr>
+          <w:noProof/>
+        </w:rPr>
+        <w:drawing>
+          <wp:inline distT="0" distB="0" distL="0" distR="0" wp14:anchorId="2A4E8EF0" wp14:editId="14162B79">
+            <wp:extent cx="5943600" cy="3241675"/>
+            <wp:effectExtent l="0" t="0" r="0" b="0"/>
+            <wp:docPr id="586549968" name="Picture 1"/>
+            <wp:cNvGraphicFramePr>
+              <a:graphicFrameLocks xmlns:a="http://schemas.openxmlformats.org/drawingml/2006/main" noChangeAspect="1"/>
+            </wp:cNvGraphicFramePr>
+            <a:graphic xmlns:a="http://schemas.openxmlformats.org/drawingml/2006/main">
+              <a:graphicData uri="http://schemas.openxmlformats.org/drawingml/2006/picture">
+                <pic:pic xmlns:pic="http://schemas.openxmlformats.org/drawingml/2006/picture">
+                  <pic:nvPicPr>
+                    <pic:cNvPr id="586549968" name=""/>
+                    <pic:cNvPicPr/>
+                  </pic:nvPicPr>
+                  <pic:blipFill>
+                    <a:blip r:embed="rId24"/>
+                    <a:stretch>
+                      <a:fillRect/>
+                    </a:stretch>
+                  </pic:blipFill>
+                  <pic:spPr>
+                    <a:xfrm>
+                      <a:off x="0" y="0"/>
+                      <a:ext cx="5943600" cy="3241675"/>
+                    </a:xfrm>
+                    <a:prstGeom prst="rect">
+                      <a:avLst/>
+                    </a:prstGeom>
+                  </pic:spPr>
+                </pic:pic>
+              </a:graphicData>
+            </a:graphic>
+          </wp:inline>
+        </w:drawing>
+      </w:r>
+    </w:p>
+    <w:p/>
+    <w:p/>
+    <w:p>
+      <w:pPr>
+        <w:pStyle w:val="IntenseQuote"/>
+      </w:pPr>
+      <w:r>
+        <w:t>Jinja-2 (A new advance templating language of python)</w:t>
+      </w:r>
+    </w:p>
+    <w:p/>
+    <w:p>
+      <w:r>
+        <w:drawing>
+          <wp:inline distT="0" distB="0" distL="0" distR="0" wp14:anchorId="727B7F90" wp14:editId="0542DD22">
+            <wp:extent cx="5943600" cy="1111250"/>
+            <wp:effectExtent l="0" t="0" r="0" b="0"/>
+            <wp:docPr id="403026284" name="Picture 1"/>
+            <wp:cNvGraphicFramePr>
+              <a:graphicFrameLocks xmlns:a="http://schemas.openxmlformats.org/drawingml/2006/main" noChangeAspect="1"/>
+            </wp:cNvGraphicFramePr>
+            <a:graphic xmlns:a="http://schemas.openxmlformats.org/drawingml/2006/main">
+              <a:graphicData uri="http://schemas.openxmlformats.org/drawingml/2006/picture">
+                <pic:pic xmlns:pic="http://schemas.openxmlformats.org/drawingml/2006/picture">
+                  <pic:nvPicPr>
+                    <pic:cNvPr id="403026284" name=""/>
+                    <pic:cNvPicPr/>
+                  </pic:nvPicPr>
+                  <pic:blipFill>
+                    <a:blip r:embed="rId25"/>
+                    <a:stretch>
+                      <a:fillRect/>
+                    </a:stretch>
+                  </pic:blipFill>
+                  <pic:spPr>
+                    <a:xfrm>
+                      <a:off x="0" y="0"/>
+                      <a:ext cx="5943600" cy="1111250"/>
+                    </a:xfrm>
+                    <a:prstGeom prst="rect">
+                      <a:avLst/>
+                    </a:prstGeom>
+                  </pic:spPr>
+                </pic:pic>
+              </a:graphicData>
+            </a:graphic>
+          </wp:inline>
+        </w:drawing>
+      </w:r>
+    </w:p>
+    <w:p>
+      <w:pPr>
+        <w:tabs>
+          <w:tab w:val="left" w:pos="3144"/>
+        </w:tabs>
+      </w:pPr>
+      <w:r>
+        <w:tab/>
       </w:r>
     </w:p>
     <w:sectPr>

</xml_diff>